<commit_message>
Agrega capturas de pantalla al informe y ajusta umbral a 0.45
- Inserta imágenes de los 3 escenarios de demostración en el documento Word
- Corrige referencias al umbral de similitud (0.30 → 0.45) en informe y README
- Actualiza llm_integration.py con el nuevo umbral MIN_SIMILARITY_THRESHOLD

Co-Authored-By: Claude Sonnet 4.6 <noreply@anthropic.com>
</commit_message>
<xml_diff>
--- a/Informe_RAG_Soporte_Tecnico.docx
+++ b/Informe_RAG_Soporte_Tecnico.docx
@@ -1849,7 +1849,7 @@
           <w:sz w:val="18"/>
           <w:szCs w:val="18"/>
         </w:rPr>
-        <w:t xml:space="preserve">Usuario → Pregunta → [Embedding] → [ChromaDB top-4] → [Filtro sim≥0.30]</w:t>
+        <w:t>Usuario → Pregunta → [Embedding] → [ChromaDB top-4] → [Filtro sim≥0.45]</w:t>
       </w:r>
     </w:p>
     <w:p>
@@ -1936,17 +1936,41 @@
     <w:p>
       <w:pPr>
         <w:spacing w:after="80"/>
-      </w:pPr>
-      <w:r>
-        <w:rPr>
-          <w:rFonts w:ascii="Arial" w:cs="Arial" w:eastAsia="Arial" w:hAnsi="Arial"/>
-          <w:b/>
-          <w:bCs/>
-          <w:color w:val="2E75B6"/>
-          <w:sz w:val="20"/>
-          <w:szCs w:val="20"/>
-        </w:rPr>
-        <w:t xml:space="preserve">[Captura 1] Escenario 1 — Consulta Simple</w:t>
+        <w:jc w:val="center"/>
+      </w:pPr>
+      <w:r>
+        <w:drawing>
+          <wp:inline xmlns:a="http://schemas.openxmlformats.org/drawingml/2006/main" xmlns:pic="http://schemas.openxmlformats.org/drawingml/2006/picture">
+            <wp:extent cx="5486400" cy="5106572"/>
+            <wp:docPr id="1" name="Picture 1"/>
+            <wp:cNvGraphicFramePr>
+              <a:graphicFrameLocks noChangeAspect="1"/>
+            </wp:cNvGraphicFramePr>
+            <a:graphic>
+              <a:graphicData uri="http://schemas.openxmlformats.org/drawingml/2006/picture">
+                <pic:pic>
+                  <pic:nvPicPr>
+                    <pic:cNvPr id="0" name="captura1.png"/>
+                    <pic:cNvPicPr/>
+                  </pic:nvPicPr>
+                  <pic:blipFill>
+                    <a:blip r:embed="rId8"/>
+                    <a:stretch>
+                      <a:fillRect/>
+                    </a:stretch>
+                  </pic:blipFill>
+                  <pic:spPr>
+                    <a:xfrm>
+                      <a:off x="0" y="0"/>
+                      <a:ext cx="5486400" cy="5106572"/>
+                    </a:xfrm>
+                    <a:prstGeom prst="rect"/>
+                  </pic:spPr>
+                </pic:pic>
+              </a:graphicData>
+            </a:graphic>
+          </wp:inline>
+        </w:drawing>
       </w:r>
     </w:p>
     <w:p>
@@ -1988,17 +2012,41 @@
     <w:p>
       <w:pPr>
         <w:spacing w:after="80"/>
-      </w:pPr>
-      <w:r>
-        <w:rPr>
-          <w:rFonts w:ascii="Arial" w:cs="Arial" w:eastAsia="Arial" w:hAnsi="Arial"/>
-          <w:b/>
-          <w:bCs/>
-          <w:color w:val="2E75B6"/>
-          <w:sz w:val="20"/>
-          <w:szCs w:val="20"/>
-        </w:rPr>
-        <w:t xml:space="preserve">[Captura 2] Escenario 2 — Consulta Compleja</w:t>
+        <w:jc w:val="center"/>
+      </w:pPr>
+      <w:r>
+        <w:drawing>
+          <wp:inline xmlns:a="http://schemas.openxmlformats.org/drawingml/2006/main" xmlns:pic="http://schemas.openxmlformats.org/drawingml/2006/picture">
+            <wp:extent cx="5486400" cy="5570806"/>
+            <wp:docPr id="2" name="Picture 2"/>
+            <wp:cNvGraphicFramePr>
+              <a:graphicFrameLocks noChangeAspect="1"/>
+            </wp:cNvGraphicFramePr>
+            <a:graphic>
+              <a:graphicData uri="http://schemas.openxmlformats.org/drawingml/2006/picture">
+                <pic:pic>
+                  <pic:nvPicPr>
+                    <pic:cNvPr id="0" name="captura2.png"/>
+                    <pic:cNvPicPr/>
+                  </pic:nvPicPr>
+                  <pic:blipFill>
+                    <a:blip r:embed="rId9"/>
+                    <a:stretch>
+                      <a:fillRect/>
+                    </a:stretch>
+                  </pic:blipFill>
+                  <pic:spPr>
+                    <a:xfrm>
+                      <a:off x="0" y="0"/>
+                      <a:ext cx="5486400" cy="5570806"/>
+                    </a:xfrm>
+                    <a:prstGeom prst="rect"/>
+                  </pic:spPr>
+                </pic:pic>
+              </a:graphicData>
+            </a:graphic>
+          </wp:inline>
+        </w:drawing>
       </w:r>
     </w:p>
     <w:p>
@@ -2040,17 +2088,41 @@
     <w:p>
       <w:pPr>
         <w:spacing w:after="80"/>
-      </w:pPr>
-      <w:r>
-        <w:rPr>
-          <w:rFonts w:ascii="Arial" w:cs="Arial" w:eastAsia="Arial" w:hAnsi="Arial"/>
-          <w:b/>
-          <w:bCs/>
-          <w:color w:val="2E75B6"/>
-          <w:sz w:val="20"/>
-          <w:szCs w:val="20"/>
-        </w:rPr>
-        <w:t xml:space="preserve">[Captura 3] Escenario 3 — Consulta Sin Respuesta Documental</w:t>
+        <w:jc w:val="center"/>
+      </w:pPr>
+      <w:r>
+        <w:drawing>
+          <wp:inline xmlns:a="http://schemas.openxmlformats.org/drawingml/2006/main" xmlns:pic="http://schemas.openxmlformats.org/drawingml/2006/picture">
+            <wp:extent cx="5486400" cy="5725551"/>
+            <wp:docPr id="3" name="Picture 3"/>
+            <wp:cNvGraphicFramePr>
+              <a:graphicFrameLocks noChangeAspect="1"/>
+            </wp:cNvGraphicFramePr>
+            <a:graphic>
+              <a:graphicData uri="http://schemas.openxmlformats.org/drawingml/2006/picture">
+                <pic:pic>
+                  <pic:nvPicPr>
+                    <pic:cNvPr id="0" name="captura3.png"/>
+                    <pic:cNvPicPr/>
+                  </pic:nvPicPr>
+                  <pic:blipFill>
+                    <a:blip r:embed="rId10"/>
+                    <a:stretch>
+                      <a:fillRect/>
+                    </a:stretch>
+                  </pic:blipFill>
+                  <pic:spPr>
+                    <a:xfrm>
+                      <a:off x="0" y="0"/>
+                      <a:ext cx="5486400" cy="5725551"/>
+                    </a:xfrm>
+                    <a:prstGeom prst="rect"/>
+                  </pic:spPr>
+                </pic:pic>
+              </a:graphicData>
+            </a:graphic>
+          </wp:inline>
+        </w:drawing>
       </w:r>
     </w:p>
     <w:p>
@@ -2078,7 +2150,7 @@
           <w:sz w:val="20"/>
           <w:szCs w:val="20"/>
         </w:rPr>
-        <w:t xml:space="preserve">Resultado: Ningún fragmento supera el umbral de similitud 0,30. El sistema indica explícitamente que la información no está disponible en la documentación técnica e invita al usuario a reformular o contactar soporte. [Insertar captura de pantalla de la terminal aquí]</w:t>
+        <w:t>Resultado: Ningún fragmento supera el umbral de similitud 0,45. El sistema indica explícitamente que la información no está disponible en la documentación técnica e invita al usuario a reformular o contactar soporte. [Insertar captura de pantalla de la terminal aquí]</w:t>
       </w:r>
     </w:p>
     <w:p>
@@ -2123,7 +2195,7 @@
           <w:sz w:val="20"/>
           <w:szCs w:val="20"/>
         </w:rPr>
-        <w:t xml:space="preserve">Calibración del umbral de similitud: Determinar el valor mínimo de similitud coseno (0,30) para distinguir fragmentos relevantes de irrelevantes requirió pruebas empíricas con diferentes tipos de consultas.</w:t>
+        <w:t>Calibración del umbral de similitud: Determinar el valor mínimo de similitud coseno (0,45) para distinguir fragmentos relevantes de irrelevantes requirió pruebas empíricas con diferentes tipos de consultas.</w:t>
       </w:r>
     </w:p>
     <w:p>

</xml_diff>